<commit_message>
IVT - [DOC] TCB-POS: bo x-api-key/x-api-id va QR khoi thiet ke; them huong dan trien khai
Co-Authored-By: Claude Opus 5 <noreply@anthropic.com>
</commit_message>
<xml_diff>
--- a/docs/TCB-POS-00-PHAN-TICH-THIET-KE.docx
+++ b/docs/TCB-POS-00-PHAN-TICH-THIET-KE.docx
@@ -7874,6 +7874,14 @@
               </w:rPr>
               <w:t>x-api-id</w:t>
             </w:r>
+            <w:r>
+              <w:rPr>
+                <w:rFonts w:ascii="Segoe UI" w:hAnsi="Segoe UI"/>
+                <w:b w:val="0"/>
+                <w:sz w:val="18"/>
+              </w:rPr>
+              <w:t xml:space="preserve"> (tuỳ chọn)</w:t>
+            </w:r>
           </w:p>
         </w:tc>
         <w:tc>
@@ -7917,10 +7925,10 @@
             <w:r>
               <w:rPr>
                 <w:rFonts w:ascii="Segoe UI" w:hAnsi="Segoe UI"/>
-                <w:b/>
-                <w:sz w:val="18"/>
-              </w:rPr>
-              <w:t>Bổ sung</w:t>
+                <w:b w:val="0"/>
+                <w:sz w:val="18"/>
+              </w:rPr>
+              <w:t>Không dùng — máy BV không bật xác thực</w:t>
             </w:r>
           </w:p>
         </w:tc>
@@ -8218,7 +8226,7 @@
                 <w:b w:val="0"/>
                 <w:sz w:val="18"/>
               </w:rPr>
-              <w:t xml:space="preserve"> (POS tự sinh QR) / </w:t>
+              <w:t xml:space="preserve"> / </w:t>
             </w:r>
             <w:r>
               <w:rPr>
@@ -8229,14 +8237,6 @@
               </w:rPr>
               <w:t>cmd=qr_d</w:t>
             </w:r>
-            <w:r>
-              <w:rPr>
-                <w:rFonts w:ascii="Segoe UI" w:hAnsi="Segoe UI"/>
-                <w:b w:val="0"/>
-                <w:sz w:val="18"/>
-              </w:rPr>
-              <w:t xml:space="preserve"> (ECR đẩy QR data base64)</w:t>
-            </w:r>
           </w:p>
         </w:tc>
         <w:tc>
@@ -8283,7 +8283,7 @@
                 <w:b w:val="0"/>
                 <w:sz w:val="18"/>
               </w:rPr>
-              <w:t>Giai đoạn 2</w:t>
+              <w:t>Không triển khai — hợp đồng chỉ quẹt thẻ</w:t>
             </w:r>
           </w:p>
         </w:tc>
@@ -14811,7 +14811,7 @@
                 <w:rFonts w:ascii="Consolas" w:hAnsi="Consolas"/>
                 <w:sz w:val="17"/>
               </w:rPr>
-              <w:t xml:space="preserve">   x-api-key: {ApiKeyTcb}</w:t>
+              <w:t xml:space="preserve">   Content-Type: application/json; charset=UTF-8</w:t>
             </w:r>
           </w:p>
           <w:p>
@@ -14823,19 +14823,7 @@
                 <w:rFonts w:ascii="Consolas" w:hAnsi="Consolas"/>
                 <w:sz w:val="17"/>
               </w:rPr>
-              <w:t xml:space="preserve">   x-api-id : {ApiIdTcb}</w:t>
-            </w:r>
-          </w:p>
-          <w:p>
-            <w:pPr>
-              <w:spacing w:after="0" w:line="240" w:lineRule="auto"/>
-            </w:pPr>
-            <w:r>
-              <w:rPr>
-                <w:rFonts w:ascii="Consolas" w:hAnsi="Consolas"/>
-                <w:sz w:val="17"/>
-              </w:rPr>
-              <w:t xml:space="preserve">   Content-Type: application/json; charset=UTF-8</w:t>
+              <w:t xml:space="preserve">   (KHÔNG gửi x-api-key / x-api-id — 10 máy của bệnh viện không bật xác thực)</w:t>
             </w:r>
           </w:p>
           <w:p>
@@ -15683,206 +15671,6 @@
                 <w:sz w:val="18"/>
               </w:rPr>
               <w:t xml:space="preserve"> (TCB cấp sau)</w:t>
-            </w:r>
-          </w:p>
-        </w:tc>
-        <w:tc>
-          <w:tcPr>
-            <w:tcW w:type="dxa" w:w="2610"/>
-            <w:tcBorders>
-              <w:top w:val="single" w:sz="4" w:space="0" w:color="BFBFBF"/>
-              <w:left w:val="single" w:sz="4" w:space="0" w:color="BFBFBF"/>
-              <w:bottom w:val="single" w:sz="4" w:space="0" w:color="BFBFBF"/>
-              <w:right w:val="single" w:sz="4" w:space="0" w:color="BFBFBF"/>
-            </w:tcBorders>
-          </w:tcPr>
-          <w:p>
-            <w:pPr>
-              <w:spacing w:after="20"/>
-            </w:pPr>
-          </w:p>
-        </w:tc>
-      </w:tr>
-      <w:tr>
-        <w:tc>
-          <w:tcPr>
-            <w:tcW w:type="dxa" w:w="2610"/>
-            <w:tcBorders>
-              <w:top w:val="single" w:sz="4" w:space="0" w:color="BFBFBF"/>
-              <w:left w:val="single" w:sz="4" w:space="0" w:color="BFBFBF"/>
-              <w:bottom w:val="single" w:sz="4" w:space="0" w:color="BFBFBF"/>
-              <w:right w:val="single" w:sz="4" w:space="0" w:color="BFBFBF"/>
-            </w:tcBorders>
-          </w:tcPr>
-          <w:p>
-            <w:pPr>
-              <w:spacing w:after="20"/>
-            </w:pPr>
-            <w:r>
-              <w:rPr>
-                <w:rFonts w:ascii="Consolas" w:hAnsi="Consolas"/>
-                <w:b w:val="0"/>
-                <w:color w:val="B03060"/>
-                <w:sz w:val="18"/>
-              </w:rPr>
-              <w:t>apiKeyTCB</w:t>
-            </w:r>
-          </w:p>
-        </w:tc>
-        <w:tc>
-          <w:tcPr>
-            <w:tcW w:type="dxa" w:w="2610"/>
-            <w:tcBorders>
-              <w:top w:val="single" w:sz="4" w:space="0" w:color="BFBFBF"/>
-              <w:left w:val="single" w:sz="4" w:space="0" w:color="BFBFBF"/>
-              <w:bottom w:val="single" w:sz="4" w:space="0" w:color="BFBFBF"/>
-              <w:right w:val="single" w:sz="4" w:space="0" w:color="BFBFBF"/>
-            </w:tcBorders>
-          </w:tcPr>
-          <w:p>
-            <w:pPr>
-              <w:spacing w:after="20"/>
-            </w:pPr>
-            <w:r>
-              <w:rPr>
-                <w:rFonts w:ascii="Segoe UI" w:hAnsi="Segoe UI"/>
-                <w:b w:val="0"/>
-                <w:sz w:val="18"/>
-              </w:rPr>
-              <w:t>string(500)</w:t>
-            </w:r>
-          </w:p>
-        </w:tc>
-        <w:tc>
-          <w:tcPr>
-            <w:tcW w:type="dxa" w:w="2610"/>
-            <w:tcBorders>
-              <w:top w:val="single" w:sz="4" w:space="0" w:color="BFBFBF"/>
-              <w:left w:val="single" w:sz="4" w:space="0" w:color="BFBFBF"/>
-              <w:bottom w:val="single" w:sz="4" w:space="0" w:color="BFBFBF"/>
-              <w:right w:val="single" w:sz="4" w:space="0" w:color="BFBFBF"/>
-            </w:tcBorders>
-          </w:tcPr>
-          <w:p>
-            <w:pPr>
-              <w:spacing w:after="20"/>
-            </w:pPr>
-            <w:r>
-              <w:rPr>
-                <w:rFonts w:ascii="Consolas" w:hAnsi="Consolas"/>
-                <w:b w:val="0"/>
-                <w:color w:val="B03060"/>
-                <w:sz w:val="18"/>
-              </w:rPr>
-              <w:t>x-api-key</w:t>
-            </w:r>
-            <w:r>
-              <w:rPr>
-                <w:rFonts w:ascii="Segoe UI" w:hAnsi="Segoe UI"/>
-                <w:b w:val="0"/>
-                <w:sz w:val="18"/>
-              </w:rPr>
-              <w:t xml:space="preserve"> — bỏ trống nếu POS không yêu cầu xác thực</w:t>
-            </w:r>
-          </w:p>
-        </w:tc>
-        <w:tc>
-          <w:tcPr>
-            <w:tcW w:type="dxa" w:w="2610"/>
-            <w:tcBorders>
-              <w:top w:val="single" w:sz="4" w:space="0" w:color="BFBFBF"/>
-              <w:left w:val="single" w:sz="4" w:space="0" w:color="BFBFBF"/>
-              <w:bottom w:val="single" w:sz="4" w:space="0" w:color="BFBFBF"/>
-              <w:right w:val="single" w:sz="4" w:space="0" w:color="BFBFBF"/>
-            </w:tcBorders>
-          </w:tcPr>
-          <w:p>
-            <w:pPr>
-              <w:spacing w:after="20"/>
-            </w:pPr>
-          </w:p>
-        </w:tc>
-      </w:tr>
-      <w:tr>
-        <w:tc>
-          <w:tcPr>
-            <w:tcW w:type="dxa" w:w="2610"/>
-            <w:tcBorders>
-              <w:top w:val="single" w:sz="4" w:space="0" w:color="BFBFBF"/>
-              <w:left w:val="single" w:sz="4" w:space="0" w:color="BFBFBF"/>
-              <w:bottom w:val="single" w:sz="4" w:space="0" w:color="BFBFBF"/>
-              <w:right w:val="single" w:sz="4" w:space="0" w:color="BFBFBF"/>
-            </w:tcBorders>
-          </w:tcPr>
-          <w:p>
-            <w:pPr>
-              <w:spacing w:after="20"/>
-            </w:pPr>
-            <w:r>
-              <w:rPr>
-                <w:rFonts w:ascii="Consolas" w:hAnsi="Consolas"/>
-                <w:b w:val="0"/>
-                <w:color w:val="B03060"/>
-                <w:sz w:val="18"/>
-              </w:rPr>
-              <w:t>apiIdTCB</w:t>
-            </w:r>
-          </w:p>
-        </w:tc>
-        <w:tc>
-          <w:tcPr>
-            <w:tcW w:type="dxa" w:w="2610"/>
-            <w:tcBorders>
-              <w:top w:val="single" w:sz="4" w:space="0" w:color="BFBFBF"/>
-              <w:left w:val="single" w:sz="4" w:space="0" w:color="BFBFBF"/>
-              <w:bottom w:val="single" w:sz="4" w:space="0" w:color="BFBFBF"/>
-              <w:right w:val="single" w:sz="4" w:space="0" w:color="BFBFBF"/>
-            </w:tcBorders>
-          </w:tcPr>
-          <w:p>
-            <w:pPr>
-              <w:spacing w:after="20"/>
-            </w:pPr>
-            <w:r>
-              <w:rPr>
-                <w:rFonts w:ascii="Segoe UI" w:hAnsi="Segoe UI"/>
-                <w:b w:val="0"/>
-                <w:sz w:val="18"/>
-              </w:rPr>
-              <w:t>string(500)</w:t>
-            </w:r>
-          </w:p>
-        </w:tc>
-        <w:tc>
-          <w:tcPr>
-            <w:tcW w:type="dxa" w:w="2610"/>
-            <w:tcBorders>
-              <w:top w:val="single" w:sz="4" w:space="0" w:color="BFBFBF"/>
-              <w:left w:val="single" w:sz="4" w:space="0" w:color="BFBFBF"/>
-              <w:bottom w:val="single" w:sz="4" w:space="0" w:color="BFBFBF"/>
-              <w:right w:val="single" w:sz="4" w:space="0" w:color="BFBFBF"/>
-            </w:tcBorders>
-          </w:tcPr>
-          <w:p>
-            <w:pPr>
-              <w:spacing w:after="20"/>
-            </w:pPr>
-            <w:r>
-              <w:rPr>
-                <w:rFonts w:ascii="Consolas" w:hAnsi="Consolas"/>
-                <w:b w:val="0"/>
-                <w:color w:val="B03060"/>
-                <w:sz w:val="18"/>
-              </w:rPr>
-              <w:t>x-api-id</w:t>
-            </w:r>
-            <w:r>
-              <w:rPr>
-                <w:rFonts w:ascii="Segoe UI" w:hAnsi="Segoe UI"/>
-                <w:b w:val="0"/>
-                <w:sz w:val="18"/>
-              </w:rPr>
-              <w:t xml:space="preserve"> — bỏ trống nếu POS không yêu cầu xác thực</w:t>
             </w:r>
           </w:p>
         </w:tc>
@@ -19080,7 +18868,62 @@
           <w:b/>
           <w:sz w:val="22"/>
         </w:rPr>
-        <w:t>5.7 Giai đoạn 2 — thanh toán QR trên POS TCB</w:t>
+        <w:t>5.7 Thanh toán QR — KHÔNG triển khai</w:t>
+      </w:r>
+    </w:p>
+    <w:p>
+      <w:pPr>
+        <w:jc w:val="both"/>
+      </w:pPr>
+      <w:r>
+        <w:rPr>
+          <w:rFonts w:ascii="Segoe UI" w:hAnsi="Segoe UI"/>
+          <w:b/>
+          <w:sz w:val="20"/>
+        </w:rPr>
+        <w:t>Hợp đồng chốt bệnh viện chỉ dùng quẹt thẻ.</w:t>
+      </w:r>
+      <w:r>
+        <w:rPr>
+          <w:rFonts w:ascii="Segoe UI" w:hAnsi="Segoe UI"/>
+          <w:b w:val="0"/>
+          <w:sz w:val="20"/>
+        </w:rPr>
+        <w:t xml:space="preserve"> Máy TCB có sẵn chức năng QR động nhưng không đưa vào phạm vi; </w:t>
+      </w:r>
+      <w:r>
+        <w:rPr>
+          <w:rFonts w:ascii="Consolas" w:hAnsi="Consolas"/>
+          <w:b w:val="0"/>
+          <w:color w:val="B03060"/>
+          <w:sz w:val="20"/>
+        </w:rPr>
+        <w:t>PosDeviceTcb</w:t>
+      </w:r>
+      <w:r>
+        <w:rPr>
+          <w:rFonts w:ascii="Segoe UI" w:hAnsi="Segoe UI"/>
+          <w:b w:val="0"/>
+          <w:sz w:val="20"/>
+        </w:rPr>
+        <w:t xml:space="preserve"> chỉ phát lệnh </w:t>
+      </w:r>
+      <w:r>
+        <w:rPr>
+          <w:rFonts w:ascii="Consolas" w:hAnsi="Consolas"/>
+          <w:b w:val="0"/>
+          <w:color w:val="B03060"/>
+          <w:sz w:val="20"/>
+        </w:rPr>
+        <w:t>sale</w:t>
+      </w:r>
+      <w:r>
+        <w:rPr>
+          <w:rFonts w:ascii="Segoe UI" w:hAnsi="Segoe UI"/>
+          <w:b w:val="0"/>
+          <w:sz w:val="20"/>
+        </w:rPr>
+        <w:t>. Phần dưới giữ lại làm tham chiếu nếu sau này mở rộng.</w:t>
       </w:r>
     </w:p>
     <w:p>
@@ -19591,40 +19434,6 @@
                 <w:color w:val="B03060"/>
                 <w:sz w:val="18"/>
               </w:rPr>
-              <w:t>x-api-key</w:t>
-            </w:r>
-            <w:r>
-              <w:rPr>
-                <w:rFonts w:ascii="Segoe UI" w:hAnsi="Segoe UI"/>
-                <w:b w:val="0"/>
-                <w:sz w:val="18"/>
-              </w:rPr>
-              <w:t>/</w:t>
-            </w:r>
-            <w:r>
-              <w:rPr>
-                <w:rFonts w:ascii="Consolas" w:hAnsi="Consolas"/>
-                <w:b w:val="0"/>
-                <w:color w:val="B03060"/>
-                <w:sz w:val="18"/>
-              </w:rPr>
-              <w:t>x-api-id</w:t>
-            </w:r>
-            <w:r>
-              <w:rPr>
-                <w:rFonts w:ascii="Segoe UI" w:hAnsi="Segoe UI"/>
-                <w:b w:val="0"/>
-                <w:sz w:val="18"/>
-              </w:rPr>
-              <w:t xml:space="preserve">, </w:t>
-            </w:r>
-            <w:r>
-              <w:rPr>
-                <w:rFonts w:ascii="Consolas" w:hAnsi="Consolas"/>
-                <w:b w:val="0"/>
-                <w:color w:val="B03060"/>
-                <w:sz w:val="18"/>
-              </w:rPr>
               <w:t>merchInfo</w:t>
             </w:r>
             <w:r>
@@ -19827,7 +19636,7 @@
                 <w:b w:val="0"/>
                 <w:sz w:val="18"/>
               </w:rPr>
-              <w:t xml:space="preserve"> — 8 khóa TCB + gộp Get/Set</w:t>
+              <w:t xml:space="preserve"> — 6 khóa TCB + gộp Get/Set</w:t>
             </w:r>
           </w:p>
         </w:tc>
@@ -19886,7 +19695,7 @@
                 <w:b w:val="0"/>
                 <w:sz w:val="18"/>
               </w:rPr>
-              <w:t xml:space="preserve"> — thêm TCB, 5 ô nhập, nút "Kiểm tra kết nối", hiện/ẩn theo hãng</w:t>
+              <w:t xml:space="preserve"> — thêm TCB, 3 ô nhập, nút "Kiểm tra kết nối", hiện/ẩn theo hãng</w:t>
             </w:r>
           </w:p>
         </w:tc>
@@ -20138,6 +19947,233 @@
                 <w:b w:val="0"/>
                 <w:sz w:val="18"/>
               </w:rPr>
+              <w:t xml:space="preserve">Bỏ </w:t>
+            </w:r>
+            <w:r>
+              <w:rPr>
+                <w:rFonts w:ascii="Consolas" w:hAnsi="Consolas"/>
+                <w:b w:val="0"/>
+                <w:color w:val="B03060"/>
+                <w:sz w:val="18"/>
+              </w:rPr>
+              <w:t>x-api-key</w:t>
+            </w:r>
+            <w:r>
+              <w:rPr>
+                <w:rFonts w:ascii="Segoe UI" w:hAnsi="Segoe UI"/>
+                <w:b w:val="0"/>
+                <w:sz w:val="18"/>
+              </w:rPr>
+              <w:t xml:space="preserve"> / </w:t>
+            </w:r>
+            <w:r>
+              <w:rPr>
+                <w:rFonts w:ascii="Consolas" w:hAnsi="Consolas"/>
+                <w:b w:val="0"/>
+                <w:color w:val="B03060"/>
+                <w:sz w:val="18"/>
+              </w:rPr>
+              <w:t>x-api-id</w:t>
+            </w:r>
+            <w:r>
+              <w:rPr>
+                <w:rFonts w:ascii="Segoe UI" w:hAnsi="Segoe UI"/>
+                <w:b w:val="0"/>
+                <w:sz w:val="18"/>
+              </w:rPr>
+              <w:t xml:space="preserve"> khỏi cấu hình và giao diện</w:t>
+            </w:r>
+          </w:p>
+        </w:tc>
+        <w:tc>
+          <w:tcPr>
+            <w:tcW w:type="dxa" w:w="5220"/>
+            <w:tcBorders>
+              <w:top w:val="single" w:sz="4" w:space="0" w:color="BFBFBF"/>
+              <w:left w:val="single" w:sz="4" w:space="0" w:color="BFBFBF"/>
+              <w:bottom w:val="single" w:sz="4" w:space="0" w:color="BFBFBF"/>
+              <w:right w:val="single" w:sz="4" w:space="0" w:color="BFBFBF"/>
+            </w:tcBorders>
+          </w:tcPr>
+          <w:p>
+            <w:pPr>
+              <w:spacing w:after="20"/>
+            </w:pPr>
+            <w:r>
+              <w:rPr>
+                <w:rFonts w:ascii="Segoe UI" w:hAnsi="Segoe UI"/>
+                <w:b w:val="0"/>
+                <w:sz w:val="18"/>
+              </w:rPr>
+              <w:t>Xong</w:t>
+            </w:r>
+          </w:p>
+        </w:tc>
+      </w:tr>
+      <w:tr>
+        <w:tc>
+          <w:tcPr>
+            <w:tcW w:type="dxa" w:w="5220"/>
+            <w:tcBorders>
+              <w:top w:val="single" w:sz="4" w:space="0" w:color="BFBFBF"/>
+              <w:left w:val="single" w:sz="4" w:space="0" w:color="BFBFBF"/>
+              <w:bottom w:val="single" w:sz="4" w:space="0" w:color="BFBFBF"/>
+              <w:right w:val="single" w:sz="4" w:space="0" w:color="BFBFBF"/>
+            </w:tcBorders>
+          </w:tcPr>
+          <w:p>
+            <w:pPr>
+              <w:spacing w:after="20"/>
+            </w:pPr>
+            <w:r>
+              <w:rPr>
+                <w:rFonts w:ascii="Segoe UI" w:hAnsi="Segoe UI"/>
+                <w:b w:val="0"/>
+                <w:sz w:val="18"/>
+              </w:rPr>
+              <w:t xml:space="preserve">Chỉ phát lệnh </w:t>
+            </w:r>
+            <w:r>
+              <w:rPr>
+                <w:rFonts w:ascii="Consolas" w:hAnsi="Consolas"/>
+                <w:b w:val="0"/>
+                <w:color w:val="B03060"/>
+                <w:sz w:val="18"/>
+              </w:rPr>
+              <w:t>sale</w:t>
+            </w:r>
+            <w:r>
+              <w:rPr>
+                <w:rFonts w:ascii="Segoe UI" w:hAnsi="Segoe UI"/>
+                <w:b w:val="0"/>
+                <w:sz w:val="18"/>
+              </w:rPr>
+              <w:t>, không dùng QR</w:t>
+            </w:r>
+          </w:p>
+        </w:tc>
+        <w:tc>
+          <w:tcPr>
+            <w:tcW w:type="dxa" w:w="5220"/>
+            <w:tcBorders>
+              <w:top w:val="single" w:sz="4" w:space="0" w:color="BFBFBF"/>
+              <w:left w:val="single" w:sz="4" w:space="0" w:color="BFBFBF"/>
+              <w:bottom w:val="single" w:sz="4" w:space="0" w:color="BFBFBF"/>
+              <w:right w:val="single" w:sz="4" w:space="0" w:color="BFBFBF"/>
+            </w:tcBorders>
+          </w:tcPr>
+          <w:p>
+            <w:pPr>
+              <w:spacing w:after="20"/>
+            </w:pPr>
+            <w:r>
+              <w:rPr>
+                <w:rFonts w:ascii="Segoe UI" w:hAnsi="Segoe UI"/>
+                <w:b w:val="0"/>
+                <w:sz w:val="18"/>
+              </w:rPr>
+              <w:t>Xong — theo hợp đồng (§5.7)</w:t>
+            </w:r>
+          </w:p>
+        </w:tc>
+      </w:tr>
+      <w:tr>
+        <w:tc>
+          <w:tcPr>
+            <w:tcW w:type="dxa" w:w="5220"/>
+            <w:tcBorders>
+              <w:top w:val="single" w:sz="4" w:space="0" w:color="BFBFBF"/>
+              <w:left w:val="single" w:sz="4" w:space="0" w:color="BFBFBF"/>
+              <w:bottom w:val="single" w:sz="4" w:space="0" w:color="BFBFBF"/>
+              <w:right w:val="single" w:sz="4" w:space="0" w:color="BFBFBF"/>
+            </w:tcBorders>
+          </w:tcPr>
+          <w:p>
+            <w:pPr>
+              <w:spacing w:after="20"/>
+            </w:pPr>
+            <w:r>
+              <w:rPr>
+                <w:rFonts w:ascii="Segoe UI" w:hAnsi="Segoe UI"/>
+                <w:b w:val="0"/>
+                <w:sz w:val="18"/>
+              </w:rPr>
+              <w:t xml:space="preserve">Build </w:t>
+            </w:r>
+            <w:r>
+              <w:rPr>
+                <w:rFonts w:ascii="Consolas" w:hAnsi="Consolas"/>
+                <w:b w:val="0"/>
+                <w:color w:val="B03060"/>
+                <w:sz w:val="18"/>
+              </w:rPr>
+              <w:t>WCF.exe</w:t>
+            </w:r>
+            <w:r>
+              <w:rPr>
+                <w:rFonts w:ascii="Segoe UI" w:hAnsi="Segoe UI"/>
+                <w:b w:val="0"/>
+                <w:sz w:val="18"/>
+              </w:rPr>
+              <w:t xml:space="preserve"> bản .NET Framework 4.5.0</w:t>
+            </w:r>
+          </w:p>
+        </w:tc>
+        <w:tc>
+          <w:tcPr>
+            <w:tcW w:type="dxa" w:w="5220"/>
+            <w:tcBorders>
+              <w:top w:val="single" w:sz="4" w:space="0" w:color="BFBFBF"/>
+              <w:left w:val="single" w:sz="4" w:space="0" w:color="BFBFBF"/>
+              <w:bottom w:val="single" w:sz="4" w:space="0" w:color="BFBFBF"/>
+              <w:right w:val="single" w:sz="4" w:space="0" w:color="BFBFBF"/>
+            </w:tcBorders>
+          </w:tcPr>
+          <w:p>
+            <w:pPr>
+              <w:spacing w:after="20"/>
+            </w:pPr>
+            <w:r>
+              <w:rPr>
+                <w:rFonts w:ascii="Segoe UI" w:hAnsi="Segoe UI"/>
+                <w:b w:val="0"/>
+                <w:sz w:val="18"/>
+              </w:rPr>
+              <w:t xml:space="preserve">Xong — 289 KB, </w:t>
+            </w:r>
+            <w:r>
+              <w:rPr>
+                <w:rFonts w:ascii="Consolas" w:hAnsi="Consolas"/>
+                <w:b w:val="0"/>
+                <w:color w:val="B03060"/>
+                <w:sz w:val="18"/>
+              </w:rPr>
+              <w:t>bin\Debug\WCF.exe</w:t>
+            </w:r>
+          </w:p>
+        </w:tc>
+      </w:tr>
+      <w:tr>
+        <w:tc>
+          <w:tcPr>
+            <w:tcW w:type="dxa" w:w="5220"/>
+            <w:tcBorders>
+              <w:top w:val="single" w:sz="4" w:space="0" w:color="BFBFBF"/>
+              <w:left w:val="single" w:sz="4" w:space="0" w:color="BFBFBF"/>
+              <w:bottom w:val="single" w:sz="4" w:space="0" w:color="BFBFBF"/>
+              <w:right w:val="single" w:sz="4" w:space="0" w:color="BFBFBF"/>
+            </w:tcBorders>
+          </w:tcPr>
+          <w:p>
+            <w:pPr>
+              <w:spacing w:after="20"/>
+            </w:pPr>
+            <w:r>
+              <w:rPr>
+                <w:rFonts w:ascii="Segoe UI" w:hAnsi="Segoe UI"/>
+                <w:b w:val="0"/>
+                <w:sz w:val="18"/>
+              </w:rPr>
               <w:t>Chạy thử với máy POS Techcombank</w:t>
             </w:r>
           </w:p>
@@ -20170,24 +20206,7 @@
                 <w:b w:val="0"/>
                 <w:sz w:val="18"/>
               </w:rPr>
-              <w:t xml:space="preserve"> — chờ </w:t>
-            </w:r>
-            <w:r>
-              <w:rPr>
-                <w:rFonts w:ascii="Consolas" w:hAnsi="Consolas"/>
-                <w:b w:val="0"/>
-                <w:color w:val="B03060"/>
-                <w:sz w:val="18"/>
-              </w:rPr>
-              <w:t>x-api-key</w:t>
-            </w:r>
-            <w:r>
-              <w:rPr>
-                <w:rFonts w:ascii="Segoe UI" w:hAnsi="Segoe UI"/>
-                <w:b w:val="0"/>
-                <w:sz w:val="18"/>
-              </w:rPr>
-              <w:t>, chứng thư (§7)</w:t>
+              <w:t xml:space="preserve"> — chỉ còn chờ IP máy POS</w:t>
             </w:r>
           </w:p>
         </w:tc>
@@ -21192,16 +21211,7 @@
                 <w:b w:val="0"/>
                 <w:sz w:val="18"/>
               </w:rPr>
-              <w:t xml:space="preserve">Sai </w:t>
-            </w:r>
-            <w:r>
-              <w:rPr>
-                <w:rFonts w:ascii="Consolas" w:hAnsi="Consolas"/>
-                <w:b w:val="0"/>
-                <w:color w:val="B03060"/>
-                <w:sz w:val="18"/>
-              </w:rPr>
-              <w:t>x-api-key</w:t>
+              <w:t>Máy POS yêu cầu xác thực (nếu TCB bật sau này)</w:t>
             </w:r>
           </w:p>
         </w:tc>
@@ -21225,7 +21235,7 @@
                 <w:b w:val="0"/>
                 <w:sz w:val="18"/>
               </w:rPr>
-              <w:t>Trả lỗi rõ ràng, không tạo phiếu</w:t>
+              <w:t>Trả lỗi rõ ràng, không tạo phiếu — khi đó phải bổ sung lại header</w:t>
             </w:r>
           </w:p>
         </w:tc>
@@ -22085,6 +22095,14 @@
       </w:pPr>
       <w:r>
         <w:rPr>
+          <w:rFonts w:ascii="Segoe UI" w:hAnsi="Segoe UI"/>
+          <w:b w:val="0"/>
+          <w:sz w:val="20"/>
+        </w:rPr>
+        <w:t>~~</w:t>
+      </w:r>
+      <w:r>
+        <w:rPr>
           <w:rFonts w:ascii="Consolas" w:hAnsi="Consolas"/>
           <w:b w:val="0"/>
           <w:color w:val="B03060"/>
@@ -22115,7 +22133,7 @@
           <w:b w:val="0"/>
           <w:sz w:val="20"/>
         </w:rPr>
-        <w:t xml:space="preserve"> — tài liệu ghi </w:t>
+        <w:t xml:space="preserve">~~ — </w:t>
       </w:r>
       <w:r>
         <w:rPr>
@@ -22123,7 +22141,7 @@
           <w:b/>
           <w:sz w:val="20"/>
         </w:rPr>
-        <w:t>có thể bỏ qua nếu POS không yêu cầu xác thực</w:t>
+        <w:t>đã bỏ khỏi phạm vi</w:t>
       </w:r>
       <w:r>
         <w:rPr>
@@ -22131,7 +22149,7 @@
           <w:b w:val="0"/>
           <w:sz w:val="20"/>
         </w:rPr>
-        <w:t>. Cần TCB xác nhận 10 máy này có bật xác thực không, và có khác nhau giữa TEST/PROD không. Không chặn việc quẹt thử: để trống thì không gửi header, máy trả 401/403 mới là cần.</w:t>
+        <w:t>: 10 máy của bệnh viện không bật xác thực, tài liệu TCB cho phép bỏ qua tham số này.</w:t>
       </w:r>
     </w:p>
     <w:p>
@@ -23185,6 +23203,131 @@
                 <w:sz w:val="18"/>
               </w:rPr>
               <w:t>LogAction</w:t>
+            </w:r>
+          </w:p>
+        </w:tc>
+        <w:tc>
+          <w:tcPr>
+            <w:tcW w:type="dxa" w:w="3480"/>
+            <w:tcBorders>
+              <w:top w:val="single" w:sz="4" w:space="0" w:color="BFBFBF"/>
+              <w:left w:val="single" w:sz="4" w:space="0" w:color="BFBFBF"/>
+              <w:bottom w:val="single" w:sz="4" w:space="0" w:color="BFBFBF"/>
+              <w:right w:val="single" w:sz="4" w:space="0" w:color="BFBFBF"/>
+            </w:tcBorders>
+          </w:tcPr>
+          <w:p>
+            <w:pPr>
+              <w:spacing w:after="20"/>
+            </w:pPr>
+            <w:r>
+              <w:rPr>
+                <w:rFonts w:ascii="Segoe UI" w:hAnsi="Segoe UI"/>
+                <w:b w:val="0"/>
+                <w:sz w:val="18"/>
+              </w:rPr>
+              <w:t>khainq</w:t>
+            </w:r>
+          </w:p>
+        </w:tc>
+      </w:tr>
+      <w:tr>
+        <w:tc>
+          <w:tcPr>
+            <w:tcW w:type="dxa" w:w="3480"/>
+            <w:tcBorders>
+              <w:top w:val="single" w:sz="4" w:space="0" w:color="BFBFBF"/>
+              <w:left w:val="single" w:sz="4" w:space="0" w:color="BFBFBF"/>
+              <w:bottom w:val="single" w:sz="4" w:space="0" w:color="BFBFBF"/>
+              <w:right w:val="single" w:sz="4" w:space="0" w:color="BFBFBF"/>
+            </w:tcBorders>
+          </w:tcPr>
+          <w:p>
+            <w:pPr>
+              <w:spacing w:after="20"/>
+            </w:pPr>
+            <w:r>
+              <w:rPr>
+                <w:rFonts w:ascii="Segoe UI" w:hAnsi="Segoe UI"/>
+                <w:b w:val="0"/>
+                <w:sz w:val="18"/>
+              </w:rPr>
+              <w:t>2026-09-10</w:t>
+            </w:r>
+          </w:p>
+        </w:tc>
+        <w:tc>
+          <w:tcPr>
+            <w:tcW w:type="dxa" w:w="3480"/>
+            <w:tcBorders>
+              <w:top w:val="single" w:sz="4" w:space="0" w:color="BFBFBF"/>
+              <w:left w:val="single" w:sz="4" w:space="0" w:color="BFBFBF"/>
+              <w:bottom w:val="single" w:sz="4" w:space="0" w:color="BFBFBF"/>
+              <w:right w:val="single" w:sz="4" w:space="0" w:color="BFBFBF"/>
+            </w:tcBorders>
+          </w:tcPr>
+          <w:p>
+            <w:pPr>
+              <w:spacing w:after="20"/>
+            </w:pPr>
+            <w:r>
+              <w:rPr>
+                <w:rFonts w:ascii="Segoe UI" w:hAnsi="Segoe UI"/>
+                <w:b w:val="0"/>
+                <w:sz w:val="18"/>
+              </w:rPr>
+              <w:t xml:space="preserve">Bỏ hẳn </w:t>
+            </w:r>
+            <w:r>
+              <w:rPr>
+                <w:rFonts w:ascii="Consolas" w:hAnsi="Consolas"/>
+                <w:b w:val="0"/>
+                <w:color w:val="B03060"/>
+                <w:sz w:val="18"/>
+              </w:rPr>
+              <w:t>x-api-key</w:t>
+            </w:r>
+            <w:r>
+              <w:rPr>
+                <w:rFonts w:ascii="Segoe UI" w:hAnsi="Segoe UI"/>
+                <w:b w:val="0"/>
+                <w:sz w:val="18"/>
+              </w:rPr>
+              <w:t>/</w:t>
+            </w:r>
+            <w:r>
+              <w:rPr>
+                <w:rFonts w:ascii="Consolas" w:hAnsi="Consolas"/>
+                <w:b w:val="0"/>
+                <w:color w:val="B03060"/>
+                <w:sz w:val="18"/>
+              </w:rPr>
+              <w:t>x-api-id</w:t>
+            </w:r>
+            <w:r>
+              <w:rPr>
+                <w:rFonts w:ascii="Segoe UI" w:hAnsi="Segoe UI"/>
+                <w:b w:val="0"/>
+                <w:sz w:val="18"/>
+              </w:rPr>
+              <w:t xml:space="preserve"> khỏi cấu hình, giao diện và mã nguồn; chốt chỉ quẹt thẻ không dùng QR; build </w:t>
+            </w:r>
+            <w:r>
+              <w:rPr>
+                <w:rFonts w:ascii="Consolas" w:hAnsi="Consolas"/>
+                <w:b w:val="0"/>
+                <w:color w:val="B03060"/>
+                <w:sz w:val="18"/>
+              </w:rPr>
+              <w:t>WCF.exe</w:t>
+            </w:r>
+            <w:r>
+              <w:rPr>
+                <w:rFonts w:ascii="Segoe UI" w:hAnsi="Segoe UI"/>
+                <w:b w:val="0"/>
+                <w:sz w:val="18"/>
+              </w:rPr>
+              <w:t xml:space="preserve"> bản .NET 4.5.0</w:t>
             </w:r>
           </w:p>
         </w:tc>

</xml_diff>